<commit_message>
Slimmed down code into four functions. Trimmed the output to four plots thus far.
</commit_message>
<xml_diff>
--- a/Methods.docx
+++ b/Methods.docx
@@ -6,6 +6,8 @@
       <w:pPr>
         <w:pStyle w:val="Heading1"/>
       </w:pPr>
+      <w:bookmarkStart w:id="0" w:name="_GoBack"/>
+      <w:bookmarkEnd w:id="0"/>
       <w:r>
         <w:t>Abstract</w:t>
       </w:r>
@@ -294,6 +296,11 @@
       </w:r>
     </w:p>
     <w:p>
+      <w:pPr>
+        <w:rPr>
+          <w:rFonts w:eastAsiaTheme="minorEastAsia"/>
+        </w:rPr>
+      </w:pPr>
       <w:r>
         <w:tab/>
       </w:r>
@@ -307,16 +314,13 @@
         <w:t xml:space="preserve">the </w:t>
       </w:r>
       <w:r>
-        <w:t xml:space="preserve">relationship between the </w:t>
-      </w:r>
-      <w:r>
-        <w:t>dependent</w:t>
-      </w:r>
-      <w:r>
-        <w:t xml:space="preserve"> and </w:t>
-      </w:r>
-      <w:r>
-        <w:t>independent variables where the dependent variable can arise from any number of statistical distributions (e.g., binomial, Poisson, Gaussian, etc.), and the effects of the independent variables may be fixed and or random</w:t>
+        <w:t xml:space="preserve">dependent variable </w:t>
+      </w:r>
+      <w:r>
+        <w:t xml:space="preserve">arising </w:t>
+      </w:r>
+      <w:r>
+        <w:t>from any number of statistical distributions (e.g., binomial, Poisson, Gaussian, etc.), and the effects of the independent variables may be fixed and or random</w:t>
       </w:r>
       <w:r>
         <w:t xml:space="preserve">. </w:t>
@@ -331,13 +335,7 @@
         <w:t xml:space="preserve">, and the independent effects </w:t>
       </w:r>
       <w:r>
-        <w:t xml:space="preserve">related to the observations may </w:t>
-      </w:r>
-      <w:r>
-        <w:t xml:space="preserve">be </w:t>
-      </w:r>
-      <w:r>
-        <w:t xml:space="preserve">either </w:t>
+        <w:t xml:space="preserve">are a combination of </w:t>
       </w:r>
       <w:r>
         <w:t>fixed (i.e., environmental) and</w:t>
@@ -346,7 +344,13 @@
         <w:t xml:space="preserve"> or</w:t>
       </w:r>
       <w:r>
-        <w:t xml:space="preserve"> random (i.e., spatial)</w:t>
+        <w:t xml:space="preserve"> random </w:t>
+      </w:r>
+      <w:r>
+        <w:t xml:space="preserve">effects </w:t>
+      </w:r>
+      <w:r>
+        <w:t>(i.e., spatial)</w:t>
       </w:r>
       <w:r>
         <w:t xml:space="preserve">. </w:t>
@@ -375,31 +379,43 @@
       <w:r>
         <w:t>(</w:t>
       </w:r>
-      <w:commentRangeStart w:id="0"/>
+      <w:commentRangeStart w:id="1"/>
       <w:r>
         <w:t>Barnett, Ward, and Anderson 2022</w:t>
       </w:r>
-      <w:commentRangeEnd w:id="0"/>
+      <w:commentRangeEnd w:id="1"/>
       <w:r>
         <w:rPr>
           <w:rStyle w:val="CommentReference"/>
         </w:rPr>
-        <w:commentReference w:id="0"/>
+        <w:commentReference w:id="1"/>
       </w:r>
       <w:r>
         <w:t>)</w:t>
       </w:r>
       <w:r>
-        <w:t xml:space="preserve">. This package is a </w:t>
-      </w:r>
-      <w:r>
-        <w:t xml:space="preserve">high level wrapper for </w:t>
-      </w:r>
-      <w:r>
-        <w:t xml:space="preserve">incorporating </w:t>
-      </w:r>
-      <w:r>
-        <w:t xml:space="preserve">the </w:t>
+        <w:t xml:space="preserve"> – </w:t>
+      </w:r>
+      <w:r>
+        <w:t xml:space="preserve">a </w:t>
+      </w:r>
+      <w:r>
+        <w:t xml:space="preserve">high level wrapper </w:t>
+      </w:r>
+      <w:r>
+        <w:t xml:space="preserve">for </w:t>
+      </w:r>
+      <w:r>
+        <w:t xml:space="preserve">modeling </w:t>
+      </w:r>
+      <w:r>
+        <w:t xml:space="preserve">continuous spatiotemporal heterogeneity across </w:t>
+      </w:r>
+      <w:r>
+        <w:t>the study domain</w:t>
+      </w:r>
+      <w:r>
+        <w:t xml:space="preserve"> using </w:t>
       </w:r>
       <w:r>
         <w:t>stochastic partial differential equation</w:t>
@@ -411,48 +427,39 @@
         <w:t xml:space="preserve"> </w:t>
       </w:r>
       <w:r>
-        <w:t xml:space="preserve">in the </w:t>
-      </w:r>
-      <w:r>
-        <w:t>INLA</w:t>
-      </w:r>
-      <w:r>
-        <w:t xml:space="preserve"> package</w:t>
-      </w:r>
-      <w:r>
-        <w:t xml:space="preserve"> </w:t>
-      </w:r>
-      <w:r>
-        <w:t xml:space="preserve">to characterize the random </w:t>
+        <w:t xml:space="preserve">(SPDE) </w:t>
+      </w:r>
+      <w:r>
+        <w:t xml:space="preserve">to characterize the </w:t>
+      </w:r>
+      <w:r>
+        <w:t xml:space="preserve">Gaussian Markov </w:t>
+      </w:r>
+      <w:r>
+        <w:t xml:space="preserve">random </w:t>
       </w:r>
       <w:r>
         <w:t xml:space="preserve">fields </w:t>
       </w:r>
       <w:r>
-        <w:t xml:space="preserve">related to the spatial </w:t>
-      </w:r>
-      <w:r>
-        <w:t xml:space="preserve">heterogeneity in the study domain </w:t>
-      </w:r>
-      <w:r>
         <w:rPr>
           <w:rFonts w:eastAsiaTheme="minorEastAsia"/>
         </w:rPr>
         <w:t>(</w:t>
       </w:r>
-      <w:commentRangeStart w:id="1"/>
+      <w:commentRangeStart w:id="2"/>
       <w:r>
         <w:rPr>
           <w:rFonts w:eastAsiaTheme="minorEastAsia"/>
         </w:rPr>
         <w:t>Lindgren, Rue, and Lindstrom 2011</w:t>
       </w:r>
-      <w:commentRangeEnd w:id="1"/>
+      <w:commentRangeEnd w:id="2"/>
       <w:r>
         <w:rPr>
           <w:rStyle w:val="CommentReference"/>
         </w:rPr>
-        <w:commentReference w:id="1"/>
+        <w:commentReference w:id="2"/>
       </w:r>
       <w:r>
         <w:rPr>
@@ -464,33 +471,6 @@
         <w:rPr>
           <w:rFonts w:eastAsiaTheme="minorEastAsia"/>
         </w:rPr>
-        <w:t xml:space="preserve">, </w:t>
-      </w:r>
-      <w:r>
-        <w:t xml:space="preserve">as well as </w:t>
-      </w:r>
-      <w:r>
-        <w:t xml:space="preserve">Template Model Builder which </w:t>
-      </w:r>
-      <w:r>
-        <w:t xml:space="preserve">is a library of functions the implement the </w:t>
-      </w:r>
-      <w:r>
-        <w:t xml:space="preserve">Laplace approximation to efficiently estimate the marginal distribution </w:t>
-      </w:r>
-      <w:r>
-        <w:t xml:space="preserve">for joint likelihood that include both </w:t>
-      </w:r>
-      <w:r>
-        <w:t xml:space="preserve">fixed </w:t>
-      </w:r>
-      <w:r>
-        <w:t xml:space="preserve">and random </w:t>
-      </w:r>
-      <w:r>
-        <w:t>effects (Kasper et al. 20XX)</w:t>
-      </w:r>
-      <w:r>
         <w:t xml:space="preserve">. </w:t>
       </w:r>
     </w:p>
@@ -499,40 +479,13 @@
         <w:ind w:firstLine="720"/>
       </w:pPr>
       <w:r>
-        <w:t xml:space="preserve">We </w:t>
-      </w:r>
-      <w:r>
-        <w:t xml:space="preserve">assumed </w:t>
-      </w:r>
-      <w:r>
-        <w:t xml:space="preserve">a </w:t>
-      </w:r>
-      <w:r>
-        <w:t>Tweedie distribution</w:t>
-      </w:r>
-      <w:r>
-        <w:t xml:space="preserve"> for the observation</w:t>
-      </w:r>
-      <w:r>
-        <w:t xml:space="preserve">, where </w:t>
+        <w:t xml:space="preserve">We assumed a Tweedie distribution for the observation, where </w:t>
       </w:r>
       <w:r>
         <w:rPr>
           <w:rFonts w:eastAsiaTheme="minorEastAsia"/>
         </w:rPr>
-        <w:t>the expected density of juvenile or adult Coho salmon</w:t>
-      </w:r>
-      <w:r>
-        <w:rPr>
-          <w:rFonts w:eastAsiaTheme="minorEastAsia"/>
-        </w:rPr>
-        <w:t xml:space="preserve"> </w:t>
-      </w:r>
-      <w:r>
-        <w:rPr>
-          <w:rFonts w:eastAsiaTheme="minorEastAsia"/>
-        </w:rPr>
-        <w:t>(</w:t>
+        <w:t>the expected density of juvenile or spawning Coho salmon (</w:t>
       </w:r>
       <m:oMath>
         <m:r>
@@ -546,541 +499,501 @@
         <w:rPr>
           <w:rFonts w:eastAsiaTheme="minorEastAsia"/>
         </w:rPr>
-        <w:t xml:space="preserve">) is a </w:t>
+        <w:t xml:space="preserve">) is a linear combination of </w:t>
       </w:r>
       <w:r>
         <w:rPr>
           <w:rFonts w:eastAsiaTheme="minorEastAsia"/>
         </w:rPr>
-        <w:t>linear combination of fixed and random effects</w:t>
-      </w:r>
-      <w:r>
-        <w:rPr>
-          <w:rFonts w:eastAsiaTheme="minorEastAsia"/>
-        </w:rPr>
+        <w:t xml:space="preserve">fixed effects describing the relationship between juvenile and spawner densities and the parameters for the spatial precision matrix, and the random effects for deviations in juvenile and spawner abundance across space and time are estimated using </w:t>
+      </w:r>
+      <w:r>
+        <w:t xml:space="preserve">the </w:t>
+      </w:r>
+      <w:r>
+        <w:t xml:space="preserve">Laplace approximation </w:t>
+      </w:r>
+      <w:r>
+        <w:t xml:space="preserve">in Template Model Builder </w:t>
+      </w:r>
+      <w:r>
+        <w:t>(Kasper et al. 20XX)</w:t>
+      </w:r>
+      <w:r>
+        <w:t xml:space="preserve">. </w:t>
+      </w:r>
+      <w:r>
+        <w:t xml:space="preserve"> </w:t>
+      </w:r>
+      <w:r>
+        <w:t xml:space="preserve">We made several modifications to the data to improve the parameter estimation: 1) </w:t>
+      </w:r>
+      <w:r>
+        <w:t xml:space="preserve">the coordinate data </w:t>
+      </w:r>
+      <w:r>
+        <w:t xml:space="preserve">were </w:t>
+      </w:r>
+      <w:r>
+        <w:t xml:space="preserve">transformed from latitude and longitude to UTM (Universal Transverse Mercator) coordinates </w:t>
+      </w:r>
+      <w:r>
+        <w:t xml:space="preserve">using </w:t>
+      </w:r>
+      <w:r>
+        <w:t xml:space="preserve">zone 10 </w:t>
+      </w:r>
+      <w:r>
+        <w:t xml:space="preserve">and </w:t>
+      </w:r>
+      <w:r>
+        <w:t>distance</w:t>
+      </w:r>
+      <w:r>
+        <w:t>s</w:t>
+      </w:r>
+      <w:r>
+        <w:t xml:space="preserve"> in kilometers (Figure 1)</w:t>
+      </w:r>
+      <w:r>
+        <w:t xml:space="preserve">, and 2) </w:t>
+      </w:r>
+      <w:r>
+        <w:t xml:space="preserve">all of the covariates in the model were </w:t>
+      </w:r>
+      <w:r>
+        <w:t>Z</w:t>
+      </w:r>
+      <w:r>
+        <w:t xml:space="preserve">-scored </w:t>
+      </w:r>
+      <w:r>
+        <w:t xml:space="preserve">with a </w:t>
+      </w:r>
+      <w:r>
+        <w:t xml:space="preserve">mean of zero and standard deviation of one. </w:t>
+      </w:r>
+      <w:r>
+        <w:t>Unlike the GAMM or RF models, the GLMM is a parametric model that does not require any “tuning</w:t>
+      </w:r>
+      <w:r>
+        <w:t>.</w:t>
+      </w:r>
+      <w:r>
+        <w:t xml:space="preserve">” </w:t>
+      </w:r>
+      <w:r>
+        <w:lastRenderedPageBreak/>
+        <w:t>T</w:t>
+      </w:r>
+      <w:r>
+        <w:t xml:space="preserve">he </w:t>
+      </w:r>
+      <w:r>
+        <w:t xml:space="preserve">fixed effects portion of the model is similar in syntax to other </w:t>
+      </w:r>
+      <w:r>
+        <w:t xml:space="preserve">linear modeling </w:t>
+      </w:r>
+      <w:r>
+        <w:t>R packages</w:t>
+      </w:r>
+      <w:r>
+        <w:t xml:space="preserve">, but the </w:t>
+      </w:r>
+      <w:r>
+        <w:t>spatial argument</w:t>
+      </w:r>
+      <w:r>
+        <w:t>s</w:t>
+      </w:r>
+      <w:r>
+        <w:t xml:space="preserve"> </w:t>
+      </w:r>
+      <w:r>
+        <w:t xml:space="preserve">and estimation of the spatial and or spatiotemporal random effects are included using </w:t>
+      </w:r>
+      <w:r>
+        <w:t>B</w:t>
+      </w:r>
+      <w:r>
+        <w:t>oolean</w:t>
+      </w:r>
+      <w:r>
+        <w:t xml:space="preserve"> flags,</w:t>
+      </w:r>
+    </w:p>
+    <w:p>
+      <w:pPr>
+        <w:spacing w:after="0" w:line="240" w:lineRule="auto"/>
+        <w:rPr>
+          <w:rFonts w:ascii="Courier New" w:hAnsi="Courier New" w:cs="Courier New"/>
+        </w:rPr>
+      </w:pPr>
+      <w:r>
+        <w:rPr>
+          <w:rFonts w:ascii="Courier New" w:hAnsi="Courier New" w:cs="Courier New"/>
+        </w:rPr>
+        <w:t xml:space="preserve">R&gt; </w:t>
+      </w:r>
+      <w:r>
+        <w:rPr>
+          <w:rFonts w:ascii="Courier New" w:hAnsi="Courier New" w:cs="Courier New"/>
+        </w:rPr>
+        <w:t>sdmTMB("Juv.km ~ 1 +</w:t>
+      </w:r>
+      <w:r>
+        <w:rPr>
+          <w:rFonts w:ascii="Courier New" w:hAnsi="Courier New" w:cs="Courier New"/>
+        </w:rPr>
+        <w:t xml:space="preserve"> </w:t>
+      </w:r>
+      <w:r>
+        <w:rPr>
+          <w:rFonts w:ascii="Courier New" w:hAnsi="Courier New" w:cs="Courier New"/>
+        </w:rPr>
+        <w:t>fSTRM_ORDER +</w:t>
+      </w:r>
+      <w:r>
+        <w:rPr>
+          <w:rFonts w:ascii="Courier New" w:hAnsi="Courier New" w:cs="Courier New"/>
+        </w:rPr>
+        <w:t xml:space="preserve"> </w:t>
+      </w:r>
+      <w:r>
+        <w:rPr>
+          <w:rFonts w:ascii="Courier New" w:hAnsi="Courier New" w:cs="Courier New"/>
+        </w:rPr>
+        <w:t>StrmSlope +</w:t>
+      </w:r>
+      <w:r>
+        <w:rPr>
+          <w:rFonts w:ascii="Courier New" w:hAnsi="Courier New" w:cs="Courier New"/>
+        </w:rPr>
+        <w:t xml:space="preserve"> </w:t>
+      </w:r>
+      <w:r>
+        <w:rPr>
+          <w:rFonts w:ascii="Courier New" w:hAnsi="Courier New" w:cs="Courier New"/>
+        </w:rPr>
+        <w:t>WidthM +</w:t>
+      </w:r>
+    </w:p>
+    <w:p>
+      <w:pPr>
+        <w:spacing w:after="0" w:line="240" w:lineRule="auto"/>
+        <w:rPr>
+          <w:rFonts w:ascii="Courier New" w:hAnsi="Courier New" w:cs="Courier New"/>
+        </w:rPr>
+      </w:pPr>
+      <w:r>
+        <w:rPr>
+          <w:rFonts w:ascii="Courier New" w:hAnsi="Courier New" w:cs="Courier New"/>
+        </w:rPr>
+        <w:t xml:space="preserve">                       OUT_DIST +</w:t>
+      </w:r>
+      <w:r>
+        <w:rPr>
+          <w:rFonts w:ascii="Courier New" w:hAnsi="Courier New" w:cs="Courier New"/>
+        </w:rPr>
+        <w:t xml:space="preserve"> </w:t>
+      </w:r>
+      <w:r>
+        <w:rPr>
+          <w:rFonts w:ascii="Courier New" w:hAnsi="Courier New" w:cs="Courier New"/>
+        </w:rPr>
+        <w:t>SolMean +</w:t>
+      </w:r>
+      <w:r>
+        <w:rPr>
+          <w:rFonts w:ascii="Courier New" w:hAnsi="Courier New" w:cs="Courier New"/>
+        </w:rPr>
+        <w:t xml:space="preserve"> </w:t>
+      </w:r>
+      <w:r>
+        <w:rPr>
+          <w:rFonts w:ascii="Courier New" w:hAnsi="Courier New" w:cs="Courier New"/>
+        </w:rPr>
+        <w:t>MWMT_Index +</w:t>
+      </w:r>
+      <w:r>
+        <w:rPr>
+          <w:rFonts w:ascii="Courier New" w:hAnsi="Courier New" w:cs="Courier New"/>
+        </w:rPr>
+        <w:t xml:space="preserve"> </w:t>
+      </w:r>
+    </w:p>
+    <w:p>
+      <w:pPr>
+        <w:spacing w:after="0" w:line="240" w:lineRule="auto"/>
+        <w:rPr>
+          <w:rFonts w:ascii="Courier New" w:hAnsi="Courier New" w:cs="Courier New"/>
+        </w:rPr>
+      </w:pPr>
+      <w:r>
+        <w:rPr>
+          <w:rFonts w:ascii="Courier New" w:hAnsi="Courier New" w:cs="Courier New"/>
+        </w:rPr>
+        <w:t xml:space="preserve">                       W3Dppt +</w:t>
+      </w:r>
+      <w:r>
+        <w:rPr>
+          <w:rFonts w:ascii="Courier New" w:hAnsi="Courier New" w:cs="Courier New"/>
+        </w:rPr>
+        <w:t xml:space="preserve"> </w:t>
+      </w:r>
+      <w:r>
+        <w:rPr>
+          <w:rFonts w:ascii="Courier New" w:hAnsi="Courier New" w:cs="Courier New"/>
+        </w:rPr>
+        <w:t>StrmPow +</w:t>
+      </w:r>
+      <w:r>
+        <w:rPr>
+          <w:rFonts w:ascii="Courier New" w:hAnsi="Courier New" w:cs="Courier New"/>
+        </w:rPr>
+        <w:t xml:space="preserve"> </w:t>
+      </w:r>
+      <w:r>
+        <w:rPr>
+          <w:rFonts w:ascii="Courier New" w:hAnsi="Courier New" w:cs="Courier New"/>
+        </w:rPr>
+        <w:t>SprPpt +</w:t>
+      </w:r>
+      <w:r>
+        <w:rPr>
+          <w:rFonts w:ascii="Courier New" w:hAnsi="Courier New" w:cs="Courier New"/>
+        </w:rPr>
+        <w:t xml:space="preserve"> </w:t>
+      </w:r>
+      <w:r>
+        <w:rPr>
+          <w:rFonts w:ascii="Courier New" w:hAnsi="Courier New" w:cs="Courier New"/>
+        </w:rPr>
+        <w:t>IP_COHO",</w:t>
+      </w:r>
+      <w:r>
+        <w:rPr>
+          <w:rFonts w:ascii="Courier New" w:hAnsi="Courier New" w:cs="Courier New"/>
+        </w:rPr>
+        <w:t xml:space="preserve"> </w:t>
+      </w:r>
+    </w:p>
+    <w:p>
+      <w:pPr>
+        <w:spacing w:after="0" w:line="240" w:lineRule="auto"/>
+        <w:rPr>
+          <w:rFonts w:ascii="Courier New" w:hAnsi="Courier New" w:cs="Courier New"/>
+        </w:rPr>
+      </w:pPr>
+      <w:r>
+        <w:rPr>
+          <w:rFonts w:ascii="Courier New" w:hAnsi="Courier New" w:cs="Courier New"/>
+        </w:rPr>
+        <w:t xml:space="preserve">                    data = juvData,</w:t>
+      </w:r>
+      <w:r>
+        <w:rPr>
+          <w:rFonts w:ascii="Courier New" w:hAnsi="Courier New" w:cs="Courier New"/>
+        </w:rPr>
+        <w:t xml:space="preserve"> #juvenile only data</w:t>
+      </w:r>
+    </w:p>
+    <w:p>
+      <w:pPr>
+        <w:spacing w:after="0" w:line="240" w:lineRule="auto"/>
+        <w:rPr>
+          <w:rFonts w:ascii="Courier New" w:hAnsi="Courier New" w:cs="Courier New"/>
+        </w:rPr>
+      </w:pPr>
+      <w:r>
+        <w:rPr>
+          <w:rFonts w:ascii="Courier New" w:hAnsi="Courier New" w:cs="Courier New"/>
+        </w:rPr>
+        <w:t xml:space="preserve">                    mesh = mesh, </w:t>
+      </w:r>
+      <w:r>
+        <w:rPr>
+          <w:rFonts w:ascii="Courier New" w:hAnsi="Courier New" w:cs="Courier New"/>
+        </w:rPr>
+        <w:t>#inla mesh</w:t>
+      </w:r>
+      <w:r>
+        <w:rPr>
+          <w:rFonts w:ascii="Courier New" w:hAnsi="Courier New" w:cs="Courier New"/>
+        </w:rPr>
+        <w:t xml:space="preserve"> passed to sdmTMB</w:t>
+      </w:r>
+    </w:p>
+    <w:p>
+      <w:pPr>
+        <w:spacing w:after="0" w:line="240" w:lineRule="auto"/>
+        <w:rPr>
+          <w:rFonts w:ascii="Courier New" w:hAnsi="Courier New" w:cs="Courier New"/>
+        </w:rPr>
+      </w:pPr>
+      <w:r>
+        <w:rPr>
+          <w:rFonts w:ascii="Courier New" w:hAnsi="Courier New" w:cs="Courier New"/>
+        </w:rPr>
+        <w:t xml:space="preserve">                    family = tweedie(link = "log"),</w:t>
+      </w:r>
+      <w:r>
+        <w:rPr>
+          <w:rFonts w:ascii="Courier New" w:hAnsi="Courier New" w:cs="Courier New"/>
+        </w:rPr>
+        <w:t xml:space="preserve"> #tweedie </w:t>
+      </w:r>
+    </w:p>
+    <w:p>
+      <w:pPr>
+        <w:spacing w:after="0" w:line="240" w:lineRule="auto"/>
+        <w:rPr>
+          <w:rFonts w:ascii="Courier New" w:hAnsi="Courier New" w:cs="Courier New"/>
+        </w:rPr>
+      </w:pPr>
+      <w:r>
+        <w:rPr>
+          <w:rFonts w:ascii="Courier New" w:hAnsi="Courier New" w:cs="Courier New"/>
+        </w:rPr>
+        <w:t xml:space="preserve">                    time = "SpwnYr",</w:t>
+      </w:r>
+      <w:r>
+        <w:rPr>
+          <w:rFonts w:ascii="Courier New" w:hAnsi="Courier New" w:cs="Courier New"/>
+        </w:rPr>
+        <w:t xml:space="preserve"> #temporal column</w:t>
+      </w:r>
+    </w:p>
+    <w:p>
+      <w:pPr>
+        <w:spacing w:after="0" w:line="240" w:lineRule="auto"/>
+        <w:rPr>
+          <w:rFonts w:ascii="Courier New" w:hAnsi="Courier New" w:cs="Courier New"/>
+        </w:rPr>
+      </w:pPr>
+      <w:r>
+        <w:rPr>
+          <w:rFonts w:ascii="Courier New" w:hAnsi="Courier New" w:cs="Courier New"/>
+        </w:rPr>
+        <w:t xml:space="preserve">                    spatial = TRUE,</w:t>
+      </w:r>
+      <w:r>
+        <w:rPr>
+          <w:rFonts w:ascii="Courier New" w:hAnsi="Courier New" w:cs="Courier New"/>
+        </w:rPr>
+        <w:t xml:space="preserve"> #include equilibrium spatial</w:t>
+      </w:r>
+    </w:p>
+    <w:p>
+      <w:pPr>
+        <w:spacing w:after="0" w:line="240" w:lineRule="auto"/>
+        <w:rPr>
+          <w:rFonts w:ascii="Courier New" w:hAnsi="Courier New" w:cs="Courier New"/>
+        </w:rPr>
+      </w:pPr>
+      <w:r>
+        <w:rPr>
+          <w:rFonts w:ascii="Courier New" w:hAnsi="Courier New" w:cs="Courier New"/>
+        </w:rPr>
+        <w:t xml:space="preserve">                    spatiotemporal = TRUE,</w:t>
+      </w:r>
+      <w:r>
+        <w:rPr>
+          <w:rFonts w:ascii="Courier New" w:hAnsi="Courier New" w:cs="Courier New"/>
+        </w:rPr>
+        <w:t xml:space="preserve"> #spatiotemporal</w:t>
+      </w:r>
+    </w:p>
+    <w:p>
+      <w:pPr>
+        <w:spacing w:after="0" w:line="240" w:lineRule="auto"/>
+        <w:rPr>
+          <w:rFonts w:ascii="Courier New" w:hAnsi="Courier New" w:cs="Courier New"/>
+        </w:rPr>
+      </w:pPr>
+      <w:r>
+        <w:rPr>
+          <w:rFonts w:ascii="Courier New" w:hAnsi="Courier New" w:cs="Courier New"/>
+        </w:rPr>
+        <w:t xml:space="preserve">                    anisotropy = TRUE,</w:t>
+      </w:r>
+      <w:r>
+        <w:rPr>
+          <w:rFonts w:ascii="Courier New" w:hAnsi="Courier New" w:cs="Courier New"/>
+        </w:rPr>
+        <w:t xml:space="preserve"> #equal decorrelation axes</w:t>
+      </w:r>
+    </w:p>
+    <w:p>
+      <w:pPr>
+        <w:spacing w:after="0" w:line="240" w:lineRule="auto"/>
+        <w:rPr>
+          <w:rFonts w:ascii="Courier New" w:hAnsi="Courier New" w:cs="Courier New"/>
+        </w:rPr>
+      </w:pPr>
+      <w:r>
+        <w:rPr>
+          <w:rFonts w:ascii="Courier New" w:hAnsi="Courier New" w:cs="Courier New"/>
+        </w:rPr>
+        <w:t xml:space="preserve">                    silent=TRUE)</w:t>
+      </w:r>
+      <w:r>
+        <w:rPr>
+          <w:rFonts w:ascii="Courier New" w:hAnsi="Courier New" w:cs="Courier New"/>
+        </w:rPr>
+        <w:t xml:space="preserve"> #remove messages</w:t>
+      </w:r>
+    </w:p>
+    <w:p>
+      <w:pPr>
+        <w:spacing w:after="0" w:line="240" w:lineRule="auto"/>
+        <w:rPr>
+          <w:rFonts w:ascii="Courier New" w:hAnsi="Courier New" w:cs="Courier New"/>
+        </w:rPr>
+      </w:pPr>
+    </w:p>
+    <w:p>
+      <w:r>
+        <w:t>We ran 12 model forms for the GLMM</w:t>
+      </w:r>
+      <w:r>
+        <w:t xml:space="preserve">: </w:t>
+      </w:r>
+      <w:r>
+        <w:t xml:space="preserve">including </w:t>
+      </w:r>
+      <w:r>
+        <w:t xml:space="preserve">all or none of the environmental covariates, and different permutations of temporal, spatial, and spatiotemporal random deviates. </w:t>
+      </w:r>
+      <w:r>
+        <w:t xml:space="preserve">Parsimony of the </w:t>
+      </w:r>
+      <w:r>
+        <w:t xml:space="preserve">different </w:t>
+      </w:r>
+      <w:r>
+        <w:t xml:space="preserve">model </w:t>
+      </w:r>
+      <w:r>
+        <w:t>forms</w:t>
+      </w:r>
+      <w:r>
+        <w:t xml:space="preserve"> are evaluated using </w:t>
+      </w:r>
+      <w:r>
+        <w:t xml:space="preserve">marginal </w:t>
+      </w:r>
+      <w:r>
+        <w:t>AIC (Akaike 1979)</w:t>
+      </w:r>
+      <w:r>
         <w:t xml:space="preserve">, </w:t>
       </w:r>
       <w:r>
-        <w:rPr>
-          <w:rFonts w:eastAsiaTheme="minorEastAsia"/>
-          <w:i/>
-        </w:rPr>
-        <w:t>p</w:t>
-      </w:r>
-      <w:r>
-        <w:rPr>
-          <w:rFonts w:eastAsiaTheme="minorEastAsia"/>
-        </w:rPr>
-        <w:t xml:space="preserve"> is the parameter control</w:t>
-      </w:r>
-      <w:r>
-        <w:rPr>
-          <w:rFonts w:eastAsiaTheme="minorEastAsia"/>
-        </w:rPr>
-        <w:t>ling</w:t>
-      </w:r>
-      <w:r>
-        <w:rPr>
-          <w:rFonts w:eastAsiaTheme="minorEastAsia"/>
-        </w:rPr>
-        <w:t xml:space="preserve"> the shape of the distribution, and </w:t>
-      </w:r>
-      <m:oMath>
-        <m:r>
-          <w:rPr>
-            <w:rFonts w:ascii="Cambria Math" w:eastAsiaTheme="minorEastAsia" w:hAnsi="Cambria Math"/>
-          </w:rPr>
-          <m:t>θ</m:t>
-        </m:r>
-      </m:oMath>
-      <w:r>
-        <w:rPr>
-          <w:rFonts w:eastAsiaTheme="minorEastAsia"/>
-        </w:rPr>
-        <w:t xml:space="preserve"> </w:t>
-      </w:r>
-      <w:r>
-        <w:rPr>
-          <w:rFonts w:eastAsiaTheme="minorEastAsia"/>
-        </w:rPr>
-        <w:t xml:space="preserve">scales </w:t>
-      </w:r>
-      <w:r>
-        <w:rPr>
-          <w:rFonts w:eastAsiaTheme="minorEastAsia"/>
-        </w:rPr>
-        <w:t>the variance.</w:t>
-      </w:r>
-      <w:r>
-        <w:t xml:space="preserve"> </w:t>
-      </w:r>
-    </w:p>
-    <w:p>
-      <w:r>
-        <w:t xml:space="preserve">We made several modifications to the data to improve the parameter estimation: 1) </w:t>
-      </w:r>
-      <w:r>
-        <w:t xml:space="preserve">the coordinate data </w:t>
-      </w:r>
-      <w:r>
-        <w:t xml:space="preserve">were </w:t>
-      </w:r>
-      <w:r>
-        <w:t xml:space="preserve">transformed from latitude and longitude to UTM (Universal Transverse Mercator) coordinates </w:t>
-      </w:r>
-      <w:r>
-        <w:t xml:space="preserve">using </w:t>
-      </w:r>
-      <w:r>
-        <w:t xml:space="preserve">zone 10 </w:t>
-      </w:r>
-      <w:r>
         <w:t xml:space="preserve">and </w:t>
       </w:r>
       <w:r>
-        <w:t>distance</w:t>
-      </w:r>
-      <w:r>
-        <w:t>s</w:t>
-      </w:r>
-      <w:r>
-        <w:t xml:space="preserve"> in kilometers (Figure 1)</w:t>
-      </w:r>
-      <w:r>
-        <w:t xml:space="preserve">, and 2) </w:t>
-      </w:r>
-      <w:r>
-        <w:t xml:space="preserve">all of the </w:t>
-      </w:r>
-      <w:r>
-        <w:lastRenderedPageBreak/>
-        <w:t xml:space="preserve">covariates in the model were </w:t>
-      </w:r>
-      <w:r>
-        <w:t>Z</w:t>
-      </w:r>
-      <w:r>
-        <w:t xml:space="preserve">-scored </w:t>
-      </w:r>
-      <w:r>
-        <w:t xml:space="preserve">with a </w:t>
-      </w:r>
-      <w:r>
-        <w:t xml:space="preserve">mean of zero and standard deviation of one. </w:t>
-      </w:r>
-      <w:r>
-        <w:t>Unlike the GAMM or RF models, the GLMM is a parametric model that does not require any “tuning</w:t>
-      </w:r>
-      <w:r>
-        <w:t>.</w:t>
-      </w:r>
-      <w:r>
-        <w:t xml:space="preserve">” </w:t>
-      </w:r>
-    </w:p>
-    <w:p>
-      <w:pPr>
-        <w:ind w:firstLine="720"/>
-      </w:pPr>
-      <w:r>
-        <w:t>T</w:t>
-      </w:r>
-      <w:r>
-        <w:t xml:space="preserve">he </w:t>
-      </w:r>
-      <w:r>
-        <w:t xml:space="preserve">fixed effects portion of the model is similar in syntax to other </w:t>
-      </w:r>
-      <w:r>
-        <w:t xml:space="preserve">linear modeling </w:t>
-      </w:r>
-      <w:r>
-        <w:t>R packages</w:t>
-      </w:r>
-      <w:r>
-        <w:t xml:space="preserve">, but the </w:t>
-      </w:r>
-      <w:r>
-        <w:t>spatial argument</w:t>
-      </w:r>
-      <w:r>
-        <w:t>s</w:t>
-      </w:r>
-      <w:r>
-        <w:t xml:space="preserve"> </w:t>
-      </w:r>
-      <w:r>
-        <w:t xml:space="preserve">and estimation of the spatial and or spatiotemporal random effects are included using </w:t>
-      </w:r>
-      <w:r>
-        <w:t>B</w:t>
-      </w:r>
-      <w:r>
-        <w:t>oolean</w:t>
-      </w:r>
-      <w:r>
-        <w:t xml:space="preserve"> flags,</w:t>
-      </w:r>
-    </w:p>
-    <w:p>
-      <w:pPr>
-        <w:spacing w:after="0" w:line="240" w:lineRule="auto"/>
-        <w:rPr>
-          <w:rFonts w:ascii="Courier New" w:hAnsi="Courier New" w:cs="Courier New"/>
-        </w:rPr>
-      </w:pPr>
-      <w:r>
-        <w:rPr>
-          <w:rFonts w:ascii="Courier New" w:hAnsi="Courier New" w:cs="Courier New"/>
-        </w:rPr>
-        <w:t xml:space="preserve">R&gt; </w:t>
-      </w:r>
-      <w:r>
-        <w:rPr>
-          <w:rFonts w:ascii="Courier New" w:hAnsi="Courier New" w:cs="Courier New"/>
-        </w:rPr>
-        <w:t>sdmTMB("Juv.km ~ 1 +</w:t>
-      </w:r>
-      <w:r>
-        <w:rPr>
-          <w:rFonts w:ascii="Courier New" w:hAnsi="Courier New" w:cs="Courier New"/>
-        </w:rPr>
-        <w:t xml:space="preserve"> </w:t>
-      </w:r>
-      <w:r>
-        <w:rPr>
-          <w:rFonts w:ascii="Courier New" w:hAnsi="Courier New" w:cs="Courier New"/>
-        </w:rPr>
-        <w:t>fSTRM_ORDER +</w:t>
-      </w:r>
-      <w:r>
-        <w:rPr>
-          <w:rFonts w:ascii="Courier New" w:hAnsi="Courier New" w:cs="Courier New"/>
-        </w:rPr>
-        <w:t xml:space="preserve"> </w:t>
-      </w:r>
-      <w:r>
-        <w:rPr>
-          <w:rFonts w:ascii="Courier New" w:hAnsi="Courier New" w:cs="Courier New"/>
-        </w:rPr>
-        <w:t>StrmSlope +</w:t>
-      </w:r>
-      <w:r>
-        <w:rPr>
-          <w:rFonts w:ascii="Courier New" w:hAnsi="Courier New" w:cs="Courier New"/>
-        </w:rPr>
-        <w:t xml:space="preserve"> </w:t>
-      </w:r>
-      <w:r>
-        <w:rPr>
-          <w:rFonts w:ascii="Courier New" w:hAnsi="Courier New" w:cs="Courier New"/>
-        </w:rPr>
-        <w:t>WidthM +</w:t>
-      </w:r>
-    </w:p>
-    <w:p>
-      <w:pPr>
-        <w:spacing w:after="0" w:line="240" w:lineRule="auto"/>
-        <w:rPr>
-          <w:rFonts w:ascii="Courier New" w:hAnsi="Courier New" w:cs="Courier New"/>
-        </w:rPr>
-      </w:pPr>
-      <w:r>
-        <w:rPr>
-          <w:rFonts w:ascii="Courier New" w:hAnsi="Courier New" w:cs="Courier New"/>
-        </w:rPr>
-        <w:t xml:space="preserve">                       OUT_DIST +</w:t>
-      </w:r>
-      <w:r>
-        <w:rPr>
-          <w:rFonts w:ascii="Courier New" w:hAnsi="Courier New" w:cs="Courier New"/>
-        </w:rPr>
-        <w:t xml:space="preserve"> </w:t>
-      </w:r>
-      <w:r>
-        <w:rPr>
-          <w:rFonts w:ascii="Courier New" w:hAnsi="Courier New" w:cs="Courier New"/>
-        </w:rPr>
-        <w:t>SolMean +</w:t>
-      </w:r>
-      <w:r>
-        <w:rPr>
-          <w:rFonts w:ascii="Courier New" w:hAnsi="Courier New" w:cs="Courier New"/>
-        </w:rPr>
-        <w:t xml:space="preserve"> </w:t>
-      </w:r>
-      <w:r>
-        <w:rPr>
-          <w:rFonts w:ascii="Courier New" w:hAnsi="Courier New" w:cs="Courier New"/>
-        </w:rPr>
-        <w:t>MWMT_Index +</w:t>
-      </w:r>
-      <w:r>
-        <w:rPr>
-          <w:rFonts w:ascii="Courier New" w:hAnsi="Courier New" w:cs="Courier New"/>
-        </w:rPr>
-        <w:t xml:space="preserve"> </w:t>
-      </w:r>
-    </w:p>
-    <w:p>
-      <w:pPr>
-        <w:spacing w:after="0" w:line="240" w:lineRule="auto"/>
-        <w:rPr>
-          <w:rFonts w:ascii="Courier New" w:hAnsi="Courier New" w:cs="Courier New"/>
-        </w:rPr>
-      </w:pPr>
-      <w:r>
-        <w:rPr>
-          <w:rFonts w:ascii="Courier New" w:hAnsi="Courier New" w:cs="Courier New"/>
-        </w:rPr>
-        <w:t xml:space="preserve">                       W3Dppt +</w:t>
-      </w:r>
-      <w:r>
-        <w:rPr>
-          <w:rFonts w:ascii="Courier New" w:hAnsi="Courier New" w:cs="Courier New"/>
-        </w:rPr>
-        <w:t xml:space="preserve"> </w:t>
-      </w:r>
-      <w:r>
-        <w:rPr>
-          <w:rFonts w:ascii="Courier New" w:hAnsi="Courier New" w:cs="Courier New"/>
-        </w:rPr>
-        <w:t>StrmPow +</w:t>
-      </w:r>
-      <w:r>
-        <w:rPr>
-          <w:rFonts w:ascii="Courier New" w:hAnsi="Courier New" w:cs="Courier New"/>
-        </w:rPr>
-        <w:t xml:space="preserve"> </w:t>
-      </w:r>
-      <w:r>
-        <w:rPr>
-          <w:rFonts w:ascii="Courier New" w:hAnsi="Courier New" w:cs="Courier New"/>
-        </w:rPr>
-        <w:t>SprPpt +</w:t>
-      </w:r>
-      <w:r>
-        <w:rPr>
-          <w:rFonts w:ascii="Courier New" w:hAnsi="Courier New" w:cs="Courier New"/>
-        </w:rPr>
-        <w:t xml:space="preserve"> </w:t>
-      </w:r>
-      <w:r>
-        <w:rPr>
-          <w:rFonts w:ascii="Courier New" w:hAnsi="Courier New" w:cs="Courier New"/>
-        </w:rPr>
-        <w:t>IP_COHO",</w:t>
-      </w:r>
-      <w:r>
-        <w:rPr>
-          <w:rFonts w:ascii="Courier New" w:hAnsi="Courier New" w:cs="Courier New"/>
-        </w:rPr>
-        <w:t xml:space="preserve"> </w:t>
-      </w:r>
-    </w:p>
-    <w:p>
-      <w:pPr>
-        <w:spacing w:after="0" w:line="240" w:lineRule="auto"/>
-        <w:rPr>
-          <w:rFonts w:ascii="Courier New" w:hAnsi="Courier New" w:cs="Courier New"/>
-        </w:rPr>
-      </w:pPr>
-      <w:r>
-        <w:rPr>
-          <w:rFonts w:ascii="Courier New" w:hAnsi="Courier New" w:cs="Courier New"/>
-        </w:rPr>
-        <w:t xml:space="preserve">                    data = juvData,</w:t>
-      </w:r>
-      <w:r>
-        <w:rPr>
-          <w:rFonts w:ascii="Courier New" w:hAnsi="Courier New" w:cs="Courier New"/>
-        </w:rPr>
-        <w:t xml:space="preserve"> #juvenile only data</w:t>
-      </w:r>
-    </w:p>
-    <w:p>
-      <w:pPr>
-        <w:spacing w:after="0" w:line="240" w:lineRule="auto"/>
-        <w:rPr>
-          <w:rFonts w:ascii="Courier New" w:hAnsi="Courier New" w:cs="Courier New"/>
-        </w:rPr>
-      </w:pPr>
-      <w:r>
-        <w:rPr>
-          <w:rFonts w:ascii="Courier New" w:hAnsi="Courier New" w:cs="Courier New"/>
-        </w:rPr>
-        <w:t xml:space="preserve">                    mesh = mesh, </w:t>
-      </w:r>
-      <w:r>
-        <w:rPr>
-          <w:rFonts w:ascii="Courier New" w:hAnsi="Courier New" w:cs="Courier New"/>
-        </w:rPr>
-        <w:t>#inla mesh</w:t>
-      </w:r>
-      <w:r>
-        <w:rPr>
-          <w:rFonts w:ascii="Courier New" w:hAnsi="Courier New" w:cs="Courier New"/>
-        </w:rPr>
-        <w:t xml:space="preserve"> passed to sdmTMB</w:t>
-      </w:r>
-    </w:p>
-    <w:p>
-      <w:pPr>
-        <w:spacing w:after="0" w:line="240" w:lineRule="auto"/>
-        <w:rPr>
-          <w:rFonts w:ascii="Courier New" w:hAnsi="Courier New" w:cs="Courier New"/>
-        </w:rPr>
-      </w:pPr>
-      <w:r>
-        <w:rPr>
-          <w:rFonts w:ascii="Courier New" w:hAnsi="Courier New" w:cs="Courier New"/>
-        </w:rPr>
-        <w:t xml:space="preserve">                    family = tweedie(link = "log"),</w:t>
-      </w:r>
-      <w:r>
-        <w:rPr>
-          <w:rFonts w:ascii="Courier New" w:hAnsi="Courier New" w:cs="Courier New"/>
-        </w:rPr>
-        <w:t xml:space="preserve"> #tweedie </w:t>
-      </w:r>
-    </w:p>
-    <w:p>
-      <w:pPr>
-        <w:spacing w:after="0" w:line="240" w:lineRule="auto"/>
-        <w:rPr>
-          <w:rFonts w:ascii="Courier New" w:hAnsi="Courier New" w:cs="Courier New"/>
-        </w:rPr>
-      </w:pPr>
-      <w:r>
-        <w:rPr>
-          <w:rFonts w:ascii="Courier New" w:hAnsi="Courier New" w:cs="Courier New"/>
-        </w:rPr>
-        <w:t xml:space="preserve">                    time = "SpwnYr",</w:t>
-      </w:r>
-      <w:r>
-        <w:rPr>
-          <w:rFonts w:ascii="Courier New" w:hAnsi="Courier New" w:cs="Courier New"/>
-        </w:rPr>
-        <w:t xml:space="preserve"> #temporal column</w:t>
-      </w:r>
-    </w:p>
-    <w:p>
-      <w:pPr>
-        <w:spacing w:after="0" w:line="240" w:lineRule="auto"/>
-        <w:rPr>
-          <w:rFonts w:ascii="Courier New" w:hAnsi="Courier New" w:cs="Courier New"/>
-        </w:rPr>
-      </w:pPr>
-      <w:r>
-        <w:rPr>
-          <w:rFonts w:ascii="Courier New" w:hAnsi="Courier New" w:cs="Courier New"/>
-        </w:rPr>
-        <w:t xml:space="preserve">                    spatial = TRUE,</w:t>
-      </w:r>
-      <w:r>
-        <w:rPr>
-          <w:rFonts w:ascii="Courier New" w:hAnsi="Courier New" w:cs="Courier New"/>
-        </w:rPr>
-        <w:t xml:space="preserve"> #include equilibrium spatial</w:t>
-      </w:r>
-    </w:p>
-    <w:p>
-      <w:pPr>
-        <w:spacing w:after="0" w:line="240" w:lineRule="auto"/>
-        <w:rPr>
-          <w:rFonts w:ascii="Courier New" w:hAnsi="Courier New" w:cs="Courier New"/>
-        </w:rPr>
-      </w:pPr>
-      <w:r>
-        <w:rPr>
-          <w:rFonts w:ascii="Courier New" w:hAnsi="Courier New" w:cs="Courier New"/>
-        </w:rPr>
-        <w:t xml:space="preserve">                    spatiotemporal = TRUE,</w:t>
-      </w:r>
-      <w:r>
-        <w:rPr>
-          <w:rFonts w:ascii="Courier New" w:hAnsi="Courier New" w:cs="Courier New"/>
-        </w:rPr>
-        <w:t xml:space="preserve"> #spatiotemporal</w:t>
-      </w:r>
-    </w:p>
-    <w:p>
-      <w:pPr>
-        <w:spacing w:after="0" w:line="240" w:lineRule="auto"/>
-        <w:rPr>
-          <w:rFonts w:ascii="Courier New" w:hAnsi="Courier New" w:cs="Courier New"/>
-        </w:rPr>
-      </w:pPr>
-      <w:r>
-        <w:rPr>
-          <w:rFonts w:ascii="Courier New" w:hAnsi="Courier New" w:cs="Courier New"/>
-        </w:rPr>
-        <w:t xml:space="preserve">                    anisotropy = TRUE,</w:t>
-      </w:r>
-      <w:r>
-        <w:rPr>
-          <w:rFonts w:ascii="Courier New" w:hAnsi="Courier New" w:cs="Courier New"/>
-        </w:rPr>
-        <w:t xml:space="preserve"> #equal decorrelation axes</w:t>
-      </w:r>
-    </w:p>
-    <w:p>
-      <w:pPr>
-        <w:spacing w:after="0" w:line="240" w:lineRule="auto"/>
-        <w:rPr>
-          <w:rFonts w:ascii="Courier New" w:hAnsi="Courier New" w:cs="Courier New"/>
-        </w:rPr>
-      </w:pPr>
-      <w:r>
-        <w:rPr>
-          <w:rFonts w:ascii="Courier New" w:hAnsi="Courier New" w:cs="Courier New"/>
-        </w:rPr>
-        <w:t xml:space="preserve">                    silent=TRUE)</w:t>
-      </w:r>
-      <w:r>
-        <w:rPr>
-          <w:rFonts w:ascii="Courier New" w:hAnsi="Courier New" w:cs="Courier New"/>
-        </w:rPr>
-        <w:t xml:space="preserve"> #remove messages</w:t>
-      </w:r>
-    </w:p>
-    <w:p>
-      <w:pPr>
-        <w:spacing w:after="0" w:line="240" w:lineRule="auto"/>
-        <w:rPr>
-          <w:rFonts w:ascii="Courier New" w:hAnsi="Courier New" w:cs="Courier New"/>
-        </w:rPr>
-      </w:pPr>
-    </w:p>
-    <w:p>
-      <w:r>
-        <w:t xml:space="preserve">We ran 12 model forms for the GLMM, such as including </w:t>
-      </w:r>
-      <w:r>
-        <w:t xml:space="preserve">all or none of the environmental covariates, and different permutations of temporal, spatial, and spatiotemporal random deviates. </w:t>
-      </w:r>
-      <w:r>
-        <w:t xml:space="preserve">Parsimony of the </w:t>
-      </w:r>
-      <w:r>
-        <w:t xml:space="preserve">different </w:t>
-      </w:r>
-      <w:r>
-        <w:t xml:space="preserve">model </w:t>
-      </w:r>
-      <w:r>
-        <w:t>forms</w:t>
-      </w:r>
-      <w:r>
-        <w:t xml:space="preserve"> are evaluated using AIC (Akaike 1979)</w:t>
-      </w:r>
-      <w:r>
-        <w:t xml:space="preserve">, </w:t>
-      </w:r>
-      <w:r>
-        <w:t xml:space="preserve">and </w:t>
-      </w:r>
-      <w:r>
         <w:t>we use</w:t>
       </w:r>
       <w:r>
@@ -1089,16 +1002,16 @@
       <w:r>
         <w:t xml:space="preserve"> the simulation-based R package DHARMa (</w:t>
       </w:r>
-      <w:commentRangeStart w:id="2"/>
+      <w:commentRangeStart w:id="3"/>
       <w:r>
         <w:t>Hartig 2022</w:t>
       </w:r>
-      <w:commentRangeEnd w:id="2"/>
+      <w:commentRangeEnd w:id="3"/>
       <w:r>
         <w:rPr>
           <w:rStyle w:val="CommentReference"/>
         </w:rPr>
-        <w:commentReference w:id="2"/>
+        <w:commentReference w:id="3"/>
       </w:r>
       <w:r>
         <w:t>) to examine issues of model misspecification based on the residuals</w:t>
@@ -1171,16 +1084,16 @@
       <w:r>
         <w:t xml:space="preserve">to 4 to allow for complexity while avoiding overfitting (Santana et al. </w:t>
       </w:r>
-      <w:commentRangeStart w:id="3"/>
+      <w:commentRangeStart w:id="4"/>
       <w:r>
         <w:t>2012</w:t>
       </w:r>
-      <w:commentRangeEnd w:id="3"/>
+      <w:commentRangeEnd w:id="4"/>
       <w:r>
         <w:rPr>
           <w:rStyle w:val="CommentReference"/>
         </w:rPr>
-        <w:commentReference w:id="3"/>
+        <w:commentReference w:id="4"/>
       </w:r>
       <w:r>
         <w:t>)</w:t>
@@ -1189,6 +1102,22 @@
         <w:t xml:space="preserve">. </w:t>
       </w:r>
       <w:r>
+        <w:t>The spatiotemporal variability of the model is defined by a three-dimensional spline</w:t>
+      </w:r>
+      <w:r>
+        <w:t xml:space="preserve">; however, </w:t>
+      </w:r>
+      <w:r>
+        <w:t>the spatiotemporal variance</w:t>
+      </w:r>
+      <w:r>
+        <w:t xml:space="preserve"> in the GAMM is permitted to follow an unknown smooth function rather than being restricted to a Gaussian Markov process in the </w:t>
+      </w:r>
+      <w:r>
+        <w:lastRenderedPageBreak/>
+        <w:t xml:space="preserve">GLMM. </w:t>
+      </w:r>
+      <w:r>
         <w:t xml:space="preserve">The </w:t>
       </w:r>
       <w:r>
@@ -1203,16 +1132,16 @@
       <w:r>
         <w:t xml:space="preserve"> were constructed using the mgcv package R (</w:t>
       </w:r>
-      <w:commentRangeStart w:id="4"/>
+      <w:commentRangeStart w:id="5"/>
       <w:r>
         <w:t>Wood 2004</w:t>
       </w:r>
-      <w:commentRangeEnd w:id="4"/>
+      <w:commentRangeEnd w:id="5"/>
       <w:r>
         <w:rPr>
           <w:rStyle w:val="CommentReference"/>
         </w:rPr>
-        <w:commentReference w:id="4"/>
+        <w:commentReference w:id="5"/>
       </w:r>
       <w:r>
         <w:t>)</w:t>
@@ -1232,6 +1161,9 @@
       <w:r>
         <w:t>a syntax that is similar to the GLMM.</w:t>
       </w:r>
+      <w:r>
+        <w:t xml:space="preserve"> </w:t>
+      </w:r>
     </w:p>
     <w:p>
       <w:pPr>
@@ -1244,7 +1176,6 @@
         <w:rPr>
           <w:rFonts w:ascii="Courier New" w:hAnsi="Courier New" w:cs="Courier New"/>
         </w:rPr>
-        <w:lastRenderedPageBreak/>
         <w:t>R&gt; gam(</w:t>
       </w:r>
       <w:r>
@@ -1398,7 +1329,19 @@
         <w:rPr>
           <w:rFonts w:ascii="Courier New" w:hAnsi="Courier New" w:cs="Courier New"/>
         </w:rPr>
-        <w:t>s(UTM_E_km,UTM_N_km, JuvYr)</w:t>
+        <w:t>s(UTM_E_km,</w:t>
+      </w:r>
+      <w:r>
+        <w:rPr>
+          <w:rFonts w:ascii="Courier New" w:hAnsi="Courier New" w:cs="Courier New"/>
+        </w:rPr>
+        <w:t xml:space="preserve"> </w:t>
+      </w:r>
+      <w:r>
+        <w:rPr>
+          <w:rFonts w:ascii="Courier New" w:hAnsi="Courier New" w:cs="Courier New"/>
+        </w:rPr>
+        <w:t>UTM_N_km, JuvYr)</w:t>
       </w:r>
       <w:r>
         <w:rPr>
@@ -1672,25 +1615,26 @@
         <w:t xml:space="preserve">finally, </w:t>
       </w:r>
       <w:r>
-        <w:t xml:space="preserve">use the </w:t>
-      </w:r>
-      <w:r>
-        <w:t xml:space="preserve">“out-of-bag” </w:t>
-      </w:r>
-      <w:r>
-        <w:t xml:space="preserve">data not in the </w:t>
-      </w:r>
-      <w:r>
-        <w:t xml:space="preserve">bootstrapped data </w:t>
-      </w:r>
-      <w:r>
-        <w:t>to cross-validate the error rate</w:t>
+        <w:t>cross-validate the error rate</w:t>
       </w:r>
       <w:r>
         <w:t>s</w:t>
       </w:r>
       <w:r>
-        <w:t xml:space="preserve"> of the decision tree. Random forest</w:t>
+        <w:t xml:space="preserve"> of the decision tree</w:t>
+      </w:r>
+      <w:r>
+        <w:t xml:space="preserve"> using the </w:t>
+      </w:r>
+      <w:r>
+        <w:t xml:space="preserve">use the “out-of-bag” data </w:t>
+      </w:r>
+      <w:r>
+        <w:lastRenderedPageBreak/>
+        <w:t>not included in the bootstrapped data</w:t>
+      </w:r>
+      <w:r>
+        <w:t>. Random forest</w:t>
       </w:r>
       <w:r>
         <w:t xml:space="preserve"> are unique among machine learning algorithms, because they </w:t>
@@ -1728,62 +1672,63 @@
     </w:p>
     <w:p>
       <w:r>
-        <w:lastRenderedPageBreak/>
         <w:tab/>
-        <w:t>Constructing a</w:t>
-      </w:r>
-      <w:r>
+      </w:r>
+      <w:r>
+        <w:t>Random forest models</w:t>
+      </w:r>
+      <w:r>
+        <w:t xml:space="preserve"> </w:t>
+      </w:r>
+      <w:r>
+        <w:t xml:space="preserve">require </w:t>
+      </w:r>
+      <w:r>
+        <w:t>two us</w:t>
+      </w:r>
+      <w:r>
+        <w:t>er inputs: the number of covariates used at each split in the tree (</w:t>
+      </w:r>
+      <w:r>
+        <w:rPr>
+          <w:i/>
+        </w:rPr>
+        <w:t>m</w:t>
+      </w:r>
+      <w:r>
+        <w:t xml:space="preserve">), and the number of trees to grow such that each </w:t>
+      </w:r>
+      <w:r>
+        <w:t xml:space="preserve">covariate </w:t>
+      </w:r>
+      <w:r>
+        <w:t>get predicted a couple of times (</w:t>
+      </w:r>
+      <w:r>
+        <w:rPr>
+          <w:i/>
+        </w:rPr>
         <w:t>n</w:t>
       </w:r>
       <w:r>
-        <w:t xml:space="preserve"> RF model </w:t>
-      </w:r>
-      <w:r>
-        <w:t>requires two us</w:t>
-      </w:r>
-      <w:r>
-        <w:t>er inputs: the number of covariates used at each split in the tree (</w:t>
+        <w:t xml:space="preserve">). </w:t>
+      </w:r>
+      <w:r>
+        <w:t xml:space="preserve">For our purposes, we completed a gridded search of </w:t>
       </w:r>
       <w:r>
         <w:rPr>
           <w:i/>
         </w:rPr>
-        <w:t>m</w:t>
-      </w:r>
-      <w:r>
-        <w:t xml:space="preserve">), and the number of trees to grow such that each </w:t>
-      </w:r>
-      <w:r>
-        <w:t xml:space="preserve">covariate </w:t>
-      </w:r>
-      <w:r>
-        <w:t>get predicted a couple of times (</w:t>
+        <w:t xml:space="preserve">m </w:t>
+      </w:r>
+      <w:r>
+        <w:t xml:space="preserve">equal to 3, 5, 7, 9, 11 splits, and </w:t>
       </w:r>
       <w:r>
         <w:rPr>
           <w:i/>
         </w:rPr>
-        <w:t>n</w:t>
-      </w:r>
-      <w:r>
-        <w:t xml:space="preserve">). </w:t>
-      </w:r>
-      <w:r>
-        <w:t xml:space="preserve">For our purposes, we completed a gridded search of </w:t>
-      </w:r>
-      <w:r>
-        <w:rPr>
-          <w:i/>
-        </w:rPr>
-        <w:t xml:space="preserve">m </w:t>
-      </w:r>
-      <w:r>
-        <w:t xml:space="preserve">equal to 3, 5, 7, 9, 11 splits, and </w:t>
-      </w:r>
-      <w:r>
-        <w:rPr>
-          <w:i/>
-        </w:rPr>
         <w:t xml:space="preserve">n </w:t>
       </w:r>
       <w:r>
@@ -1796,18 +1741,24 @@
         <w:t>dependent variables</w:t>
       </w:r>
       <w:r>
-        <w:t xml:space="preserve"> to include in the RF models are well documents for a suite of R packages (</w:t>
-      </w:r>
-      <w:commentRangeStart w:id="5"/>
+        <w:t xml:space="preserve"> to include in </w:t>
+      </w:r>
+      <w:r>
+        <w:t>the RF models are well documented</w:t>
+      </w:r>
+      <w:r>
+        <w:t xml:space="preserve"> for a suite of R packages (</w:t>
+      </w:r>
+      <w:commentRangeStart w:id="6"/>
       <w:r>
         <w:t>Degenhardt, Seifert, and Szymczak 2019</w:t>
       </w:r>
-      <w:commentRangeEnd w:id="5"/>
+      <w:commentRangeEnd w:id="6"/>
       <w:r>
         <w:rPr>
           <w:rStyle w:val="CommentReference"/>
         </w:rPr>
-        <w:commentReference w:id="5"/>
+        <w:commentReference w:id="6"/>
       </w:r>
       <w:r>
         <w:t xml:space="preserve">); however, to maintain consistency </w:t>
@@ -1994,8 +1945,6 @@
         </w:rPr>
         <w:t xml:space="preserve"> #</w:t>
       </w:r>
-      <w:bookmarkStart w:id="6" w:name="_GoBack"/>
-      <w:bookmarkEnd w:id="6"/>
       <w:r>
         <w:rPr>
           <w:rFonts w:ascii="Courier New" w:hAnsi="Courier New" w:cs="Courier New"/>
@@ -2157,7 +2106,11 @@
         <w:tab/>
       </w:r>
       <w:r>
-        <w:t xml:space="preserve">To assess the predictive ability of the top models we trained each model by removing the last one or two years of data. Then we predicted the out-of-bag years and calculated the RMSE for the last five years of data (i.e., years with both training and out-of-bag data). The model with the lowest RMSE was assumed to be the model with the most predictive ability. </w:t>
+        <w:t xml:space="preserve">To assess the predictive ability of the top models we trained each model by removing the last one or two years of data. Then we predicted the out-of-bag years and calculated the RMSE </w:t>
+      </w:r>
+      <w:r>
+        <w:lastRenderedPageBreak/>
+        <w:t xml:space="preserve">for the last five years of data (i.e., years with both training and out-of-bag data). The model with the lowest RMSE was assumed to be the model with the most predictive ability. </w:t>
       </w:r>
     </w:p>
     <w:p>
@@ -2173,14 +2126,358 @@
         <w:t>Results</w:t>
       </w:r>
     </w:p>
+    <w:p/>
+    <w:p>
+      <w:r>
+        <w:rPr>
+          <w:noProof/>
+        </w:rPr>
+        <w:drawing>
+          <wp:inline distT="0" distB="0" distL="0" distR="0" wp14:anchorId="5B67DD61" wp14:editId="59873727">
+            <wp:extent cx="5715000" cy="5715000"/>
+            <wp:effectExtent l="0" t="0" r="0" b="0"/>
+            <wp:docPr id="3" name="Picture 3"/>
+            <wp:cNvGraphicFramePr>
+              <a:graphicFrameLocks xmlns:a="http://schemas.openxmlformats.org/drawingml/2006/main" noChangeAspect="1"/>
+            </wp:cNvGraphicFramePr>
+            <a:graphic xmlns:a="http://schemas.openxmlformats.org/drawingml/2006/main">
+              <a:graphicData uri="http://schemas.openxmlformats.org/drawingml/2006/picture">
+                <pic:pic xmlns:pic="http://schemas.openxmlformats.org/drawingml/2006/picture">
+                  <pic:nvPicPr>
+                    <pic:cNvPr id="3" name="plot_comp_spatial_by_lifeStage.png"/>
+                    <pic:cNvPicPr/>
+                  </pic:nvPicPr>
+                  <pic:blipFill>
+                    <a:blip r:embed="rId9">
+                      <a:extLst>
+                        <a:ext uri="{28A0092B-C50C-407E-A947-70E740481C1C}">
+                          <a14:useLocalDpi xmlns:a14="http://schemas.microsoft.com/office/drawing/2010/main" val="0"/>
+                        </a:ext>
+                      </a:extLst>
+                    </a:blip>
+                    <a:stretch>
+                      <a:fillRect/>
+                    </a:stretch>
+                  </pic:blipFill>
+                  <pic:spPr>
+                    <a:xfrm>
+                      <a:off x="0" y="0"/>
+                      <a:ext cx="5715000" cy="5715000"/>
+                    </a:xfrm>
+                    <a:prstGeom prst="rect">
+                      <a:avLst/>
+                    </a:prstGeom>
+                  </pic:spPr>
+                </pic:pic>
+              </a:graphicData>
+            </a:graphic>
+          </wp:inline>
+        </w:drawing>
+      </w:r>
+    </w:p>
     <w:p>
       <w:r>
         <w:lastRenderedPageBreak/>
-        <w:t xml:space="preserve"> </w:t>
-      </w:r>
-      <w:r>
+        <w:t xml:space="preserve">Predicted distribution of </w:t>
+      </w:r>
+      <w:r>
+        <w:t>juvenile</w:t>
+      </w:r>
+      <w:r>
+        <w:t xml:space="preserve"> spawners during 2019 using the best fit, covariate-only, and the spatial-only forms of the GAMM, GLMM, and random forecast models</w:t>
+      </w:r>
+      <w:r>
+        <w:t xml:space="preserve"> </w:t>
+      </w:r>
+      <w:r>
+        <w:t>(</w:t>
+      </w:r>
+      <w:r>
+        <w:t>gg</w:t>
+      </w:r>
+      <w:r>
+        <w:t>plot_comp_spatial_by_lifeStage</w:t>
+      </w:r>
+      <w:r>
+        <w:t>.r).</w:t>
+      </w:r>
+    </w:p>
+    <w:p>
+      <w:r>
+        <w:rPr>
+          <w:noProof/>
+        </w:rPr>
+        <w:drawing>
+          <wp:inline distT="0" distB="0" distL="0" distR="0" wp14:anchorId="2AEB291F" wp14:editId="6B2C04CB">
+            <wp:extent cx="5715000" cy="5715000"/>
+            <wp:effectExtent l="0" t="0" r="0" b="0"/>
+            <wp:docPr id="4" name="Picture 4"/>
+            <wp:cNvGraphicFramePr>
+              <a:graphicFrameLocks xmlns:a="http://schemas.openxmlformats.org/drawingml/2006/main" noChangeAspect="1"/>
+            </wp:cNvGraphicFramePr>
+            <a:graphic xmlns:a="http://schemas.openxmlformats.org/drawingml/2006/main">
+              <a:graphicData uri="http://schemas.openxmlformats.org/drawingml/2006/picture">
+                <pic:pic xmlns:pic="http://schemas.openxmlformats.org/drawingml/2006/picture">
+                  <pic:nvPicPr>
+                    <pic:cNvPr id="4" name="plot_comp_spatial_by_lifeStage.png"/>
+                    <pic:cNvPicPr/>
+                  </pic:nvPicPr>
+                  <pic:blipFill>
+                    <a:blip r:embed="rId10">
+                      <a:extLst>
+                        <a:ext uri="{28A0092B-C50C-407E-A947-70E740481C1C}">
+                          <a14:useLocalDpi xmlns:a14="http://schemas.microsoft.com/office/drawing/2010/main" val="0"/>
+                        </a:ext>
+                      </a:extLst>
+                    </a:blip>
+                    <a:stretch>
+                      <a:fillRect/>
+                    </a:stretch>
+                  </pic:blipFill>
+                  <pic:spPr>
+                    <a:xfrm>
+                      <a:off x="0" y="0"/>
+                      <a:ext cx="5715000" cy="5715000"/>
+                    </a:xfrm>
+                    <a:prstGeom prst="rect">
+                      <a:avLst/>
+                    </a:prstGeom>
+                  </pic:spPr>
+                </pic:pic>
+              </a:graphicData>
+            </a:graphic>
+          </wp:inline>
+        </w:drawing>
+      </w:r>
+    </w:p>
+    <w:p>
+      <w:r>
+        <w:t>Predicted distribution of adult spawners during 2019 using the best fit, covariate-only, and the spatial-only forms of the GAMM, GLMM, and random forecast models (</w:t>
+      </w:r>
+      <w:r>
+        <w:t>gg</w:t>
+      </w:r>
+      <w:r>
+        <w:t>plot_comp_spatial_by_lifeStage</w:t>
+      </w:r>
+      <w:r>
+        <w:t xml:space="preserve">.r). </w:t>
+      </w:r>
+    </w:p>
+    <w:p/>
+    <w:p>
+      <w:r>
+        <w:rPr>
+          <w:noProof/>
+        </w:rPr>
+        <w:drawing>
+          <wp:inline distT="0" distB="0" distL="0" distR="0" wp14:anchorId="11E980B7" wp14:editId="631A15D1">
+            <wp:extent cx="5715000" cy="5715000"/>
+            <wp:effectExtent l="0" t="0" r="0" b="0"/>
+            <wp:docPr id="6" name="Picture 6"/>
+            <wp:cNvGraphicFramePr>
+              <a:graphicFrameLocks xmlns:a="http://schemas.openxmlformats.org/drawingml/2006/main" noChangeAspect="1"/>
+            </wp:cNvGraphicFramePr>
+            <a:graphic xmlns:a="http://schemas.openxmlformats.org/drawingml/2006/main">
+              <a:graphicData uri="http://schemas.openxmlformats.org/drawingml/2006/picture">
+                <pic:pic xmlns:pic="http://schemas.openxmlformats.org/drawingml/2006/picture">
+                  <pic:nvPicPr>
+                    <pic:cNvPr id="6" name="spatial_index.png"/>
+                    <pic:cNvPicPr/>
+                  </pic:nvPicPr>
+                  <pic:blipFill>
+                    <a:blip r:embed="rId11">
+                      <a:extLst>
+                        <a:ext uri="{28A0092B-C50C-407E-A947-70E740481C1C}">
+                          <a14:useLocalDpi xmlns:a14="http://schemas.microsoft.com/office/drawing/2010/main" val="0"/>
+                        </a:ext>
+                      </a:extLst>
+                    </a:blip>
+                    <a:stretch>
+                      <a:fillRect/>
+                    </a:stretch>
+                  </pic:blipFill>
+                  <pic:spPr>
+                    <a:xfrm>
+                      <a:off x="0" y="0"/>
+                      <a:ext cx="5715000" cy="5715000"/>
+                    </a:xfrm>
+                    <a:prstGeom prst="rect">
+                      <a:avLst/>
+                    </a:prstGeom>
+                  </pic:spPr>
+                </pic:pic>
+              </a:graphicData>
+            </a:graphic>
+          </wp:inline>
+        </w:drawing>
+      </w:r>
+    </w:p>
+    <w:p>
+      <w:r>
+        <w:t xml:space="preserve">Estimated </w:t>
+      </w:r>
+      <w:r>
+        <w:t xml:space="preserve">indexes </w:t>
+      </w:r>
+      <w:r>
+        <w:t xml:space="preserve">of </w:t>
+      </w:r>
+      <w:r>
+        <w:t>juvenile and spawner abundance for Coho salmon in the Coastal Oregon ESU form 1998 to 2019 (</w:t>
+      </w:r>
+      <w:r>
+        <w:t>ggplot_spatial_index</w:t>
+      </w:r>
+      <w:r>
+        <w:t xml:space="preserve">.r). </w:t>
+      </w:r>
+    </w:p>
+    <w:p/>
+    <w:p>
+      <w:r>
+        <w:rPr>
+          <w:noProof/>
+        </w:rPr>
+        <w:lastRenderedPageBreak/>
+        <w:drawing>
+          <wp:inline distT="0" distB="0" distL="0" distR="0" wp14:anchorId="6CB0F2A7" wp14:editId="2294A2B1">
+            <wp:extent cx="5715000" cy="5715000"/>
+            <wp:effectExtent l="0" t="0" r="0" b="0"/>
+            <wp:docPr id="5" name="Picture 5"/>
+            <wp:cNvGraphicFramePr>
+              <a:graphicFrameLocks xmlns:a="http://schemas.openxmlformats.org/drawingml/2006/main" noChangeAspect="1"/>
+            </wp:cNvGraphicFramePr>
+            <a:graphic xmlns:a="http://schemas.openxmlformats.org/drawingml/2006/main">
+              <a:graphicData uri="http://schemas.openxmlformats.org/drawingml/2006/picture">
+                <pic:pic xmlns:pic="http://schemas.openxmlformats.org/drawingml/2006/picture">
+                  <pic:nvPicPr>
+                    <pic:cNvPr id="5" name="spatial_index2.png"/>
+                    <pic:cNvPicPr/>
+                  </pic:nvPicPr>
+                  <pic:blipFill>
+                    <a:blip r:embed="rId12">
+                      <a:extLst>
+                        <a:ext uri="{28A0092B-C50C-407E-A947-70E740481C1C}">
+                          <a14:useLocalDpi xmlns:a14="http://schemas.microsoft.com/office/drawing/2010/main" val="0"/>
+                        </a:ext>
+                      </a:extLst>
+                    </a:blip>
+                    <a:stretch>
+                      <a:fillRect/>
+                    </a:stretch>
+                  </pic:blipFill>
+                  <pic:spPr>
+                    <a:xfrm>
+                      <a:off x="0" y="0"/>
+                      <a:ext cx="5715000" cy="5715000"/>
+                    </a:xfrm>
+                    <a:prstGeom prst="rect">
+                      <a:avLst/>
+                    </a:prstGeom>
+                  </pic:spPr>
+                </pic:pic>
+              </a:graphicData>
+            </a:graphic>
+          </wp:inline>
+        </w:drawing>
+      </w:r>
+    </w:p>
+    <w:p>
+      <w:r>
+        <w:t>Comparison between the indexes of juvenile and spawner abundance for Coho salmon in the Coastal Oregon ESU form 1998 to 2019</w:t>
+      </w:r>
+      <w:r>
+        <w:t xml:space="preserve"> (gg</w:t>
+      </w:r>
+      <w:r>
+        <w:t>plot_spatial_index2</w:t>
+      </w:r>
+      <w:r>
+        <w:t>.r)</w:t>
+      </w:r>
+      <w:r>
+        <w:t xml:space="preserve">. </w:t>
+      </w:r>
+    </w:p>
+    <w:p/>
+    <w:p>
+      <w:pPr>
+        <w:rPr>
+          <w:b/>
+        </w:rPr>
+      </w:pPr>
+      <w:r>
+        <w:rPr>
+          <w:b/>
+        </w:rPr>
+        <w:t xml:space="preserve">Supplemental </w:t>
+      </w:r>
+      <w:r>
+        <w:rPr>
+          <w:b/>
+        </w:rPr>
+        <w:t>Material</w:t>
+      </w:r>
+    </w:p>
+    <w:p>
+      <w:r>
+        <w:rPr>
+          <w:b/>
+        </w:rPr>
         <w:tab/>
-        <w:t>For predicting the juvenile and adult densities of Coho salmon in coastal Oregon tributaries, the forms of the GLMM, GAMM, and RF models that best explain the data include spatiotemporal processes (Table 1). Using test statistics in the DHARMa package we found no evidence of model misspecification for either the GLMM, , or GAMM, , model forms.</w:t>
+      </w:r>
+      <w:r>
+        <w:t>For the purposes of reproducibility, we created four wrapper functions in R. The first</w:t>
+      </w:r>
+      <w:r>
+        <w:t xml:space="preserve"> function</w:t>
+      </w:r>
+      <w:r>
+        <w:t xml:space="preserve">, </w:t>
+      </w:r>
+      <w:r>
+        <w:rPr>
+          <w:b/>
+        </w:rPr>
+        <w:t>function_wrangle_data.r</w:t>
+      </w:r>
+      <w:r>
+        <w:t xml:space="preserve">, reads </w:t>
+      </w:r>
+      <w:r>
+        <w:t xml:space="preserve">in the data and returns a data frame </w:t>
+      </w:r>
+      <w:r>
+        <w:t xml:space="preserve">of juvenile and </w:t>
+      </w:r>
+      <w:r>
+        <w:lastRenderedPageBreak/>
+        <w:t xml:space="preserve">spawner </w:t>
+      </w:r>
+      <w:r>
+        <w:t xml:space="preserve">density for the Coastal Oregon Evolutionary Significant Unit. The second function, </w:t>
+      </w:r>
+      <w:r>
+        <w:rPr>
+          <w:b/>
+        </w:rPr>
+        <w:t>function_model_search.r</w:t>
+      </w:r>
+      <w:r>
+        <w:t xml:space="preserve">, creates a tagged list of model formulas and arguments for each of the three model types: GAMM (R package mgcv), GLMM (R package sdmTMB), and random forest (R package RandomForest). For each model type (i.e., GAMM, GLMM, and RF), the third function, </w:t>
+      </w:r>
+      <w:r>
+        <w:rPr>
+          <w:b/>
+        </w:rPr>
+        <w:t>function_model_exploration.r</w:t>
+      </w:r>
+      <w:r>
+        <w:t xml:space="preserve">, measures the performance </w:t>
+      </w:r>
+      <w:r>
+        <w:t xml:space="preserve">of each model type for predicting historical data and projecting salmon densities into the future. </w:t>
       </w:r>
     </w:p>
     <w:sectPr>
@@ -2195,7 +2492,7 @@
 
 <file path=word/comments.xml><?xml version="1.0" encoding="utf-8"?>
 <w:comments xmlns:wpc="http://schemas.microsoft.com/office/word/2010/wordprocessingCanvas" xmlns:cx="http://schemas.microsoft.com/office/drawing/2014/chartex" xmlns:cx1="http://schemas.microsoft.com/office/drawing/2015/9/8/chartex" xmlns:mc="http://schemas.openxmlformats.org/markup-compatibility/2006" xmlns:o="urn:schemas-microsoft-com:office:office" xmlns:r="http://schemas.openxmlformats.org/officeDocument/2006/relationships" xmlns:m="http://schemas.openxmlformats.org/officeDocument/2006/math" xmlns:v="urn:schemas-microsoft-com:vml" xmlns:wp14="http://schemas.microsoft.com/office/word/2010/wordprocessingDrawing" xmlns:wp="http://schemas.openxmlformats.org/drawingml/2006/wordprocessingDrawing" xmlns:w10="urn:schemas-microsoft-com:office:word" xmlns:w="http://schemas.openxmlformats.org/wordprocessingml/2006/main" xmlns:w14="http://schemas.microsoft.com/office/word/2010/wordml" xmlns:w15="http://schemas.microsoft.com/office/word/2012/wordml" xmlns:w16se="http://schemas.microsoft.com/office/word/2015/wordml/symex" xmlns:wpg="http://schemas.microsoft.com/office/word/2010/wordprocessingGroup" xmlns:wpi="http://schemas.microsoft.com/office/word/2010/wordprocessingInk" xmlns:wne="http://schemas.microsoft.com/office/word/2006/wordml" xmlns:wps="http://schemas.microsoft.com/office/word/2010/wordprocessingShape" mc:Ignorable="w14 w15 w16se wp14">
-  <w:comment w:id="0" w:author="Chasco, Brandon Edward" w:date="2022-07-11T13:22:00Z" w:initials="CBE">
+  <w:comment w:id="1" w:author="Chasco, Brandon Edward" w:date="2022-07-11T13:22:00Z" w:initials="CBE">
     <w:p>
       <w:pPr>
         <w:pStyle w:val="CommentText"/>
@@ -2211,7 +2508,7 @@
       </w:r>
     </w:p>
   </w:comment>
-  <w:comment w:id="1" w:author="Chasco, Brandon Edward" w:date="2022-07-11T12:56:00Z" w:initials="CBE">
+  <w:comment w:id="2" w:author="Chasco, Brandon Edward" w:date="2022-07-11T12:56:00Z" w:initials="CBE">
     <w:p>
       <w:pPr>
         <w:pStyle w:val="CommentText"/>
@@ -2227,7 +2524,7 @@
       </w:r>
     </w:p>
   </w:comment>
-  <w:comment w:id="2" w:author="Chasco, Brandon Edward" w:date="2022-07-11T13:31:00Z" w:initials="CBE">
+  <w:comment w:id="3" w:author="Chasco, Brandon Edward" w:date="2022-07-11T13:31:00Z" w:initials="CBE">
     <w:p>
       <w:pPr>
         <w:pStyle w:val="CommentText"/>
@@ -2243,7 +2540,7 @@
       </w:r>
     </w:p>
   </w:comment>
-  <w:comment w:id="3" w:author="Chasco, Brandon Edward" w:date="2022-07-11T11:27:00Z" w:initials="CBE">
+  <w:comment w:id="4" w:author="Chasco, Brandon Edward" w:date="2022-07-11T11:27:00Z" w:initials="CBE">
     <w:p>
       <w:pPr>
         <w:pStyle w:val="CommentText"/>
@@ -2259,7 +2556,7 @@
       </w:r>
     </w:p>
   </w:comment>
-  <w:comment w:id="4" w:author="Chasco, Brandon Edward" w:date="2022-07-12T00:04:00Z" w:initials="CBE">
+  <w:comment w:id="5" w:author="Chasco, Brandon Edward" w:date="2022-07-12T00:04:00Z" w:initials="CBE">
     <w:p>
       <w:pPr>
         <w:pStyle w:val="CommentText"/>
@@ -2291,7 +2588,7 @@
       </w:r>
     </w:p>
   </w:comment>
-  <w:comment w:id="5" w:author="Chasco, Brandon Edward" w:date="2022-07-11T20:16:00Z" w:initials="CBE">
+  <w:comment w:id="6" w:author="Chasco, Brandon Edward" w:date="2022-07-11T20:16:00Z" w:initials="CBE">
     <w:p>
       <w:pPr>
         <w:pStyle w:val="CommentText"/>
@@ -3362,7 +3659,7 @@
 </file>
 
 <file path=customXml/itemProps1.xml><?xml version="1.0" encoding="utf-8"?>
-<ds:datastoreItem xmlns:ds="http://schemas.openxmlformats.org/officeDocument/2006/customXml" ds:itemID="{97596854-3880-4418-B644-F9AAF752B10C}">
+<ds:datastoreItem xmlns:ds="http://schemas.openxmlformats.org/officeDocument/2006/customXml" ds:itemID="{BF910EB0-0A88-4B4C-B1C5-249EBF43FC22}">
   <ds:schemaRefs>
     <ds:schemaRef ds:uri="http://schemas.openxmlformats.org/officeDocument/2006/bibliography"/>
   </ds:schemaRefs>

</xml_diff>

<commit_message>
Updated several plots and functions with Katie Kennedy.
</commit_message>
<xml_diff>
--- a/Methods.docx
+++ b/Methods.docx
@@ -6,8 +6,6 @@
       <w:pPr>
         <w:pStyle w:val="Heading1"/>
       </w:pPr>
-      <w:bookmarkStart w:id="0" w:name="_GoBack"/>
-      <w:bookmarkEnd w:id="0"/>
       <w:r>
         <w:t>Abstract</w:t>
       </w:r>
@@ -379,9 +377,80 @@
       <w:r>
         <w:t>(</w:t>
       </w:r>
+      <w:commentRangeStart w:id="0"/>
+      <w:r>
+        <w:t>Barnett, Ward, and Anderson 2022</w:t>
+      </w:r>
+      <w:commentRangeEnd w:id="0"/>
+      <w:r>
+        <w:rPr>
+          <w:rStyle w:val="CommentReference"/>
+        </w:rPr>
+        <w:commentReference w:id="0"/>
+      </w:r>
+      <w:r>
+        <w:t>)</w:t>
+      </w:r>
+      <w:r>
+        <w:t xml:space="preserve"> – </w:t>
+      </w:r>
+      <w:r>
+        <w:t xml:space="preserve">a </w:t>
+      </w:r>
+      <w:r>
+        <w:t xml:space="preserve">high level wrapper </w:t>
+      </w:r>
+      <w:r>
+        <w:t xml:space="preserve">for </w:t>
+      </w:r>
+      <w:r>
+        <w:t xml:space="preserve">modeling </w:t>
+      </w:r>
+      <w:r>
+        <w:t xml:space="preserve">continuous spatiotemporal heterogeneity across </w:t>
+      </w:r>
+      <w:r>
+        <w:t>the study domain</w:t>
+      </w:r>
+      <w:r>
+        <w:t xml:space="preserve"> using </w:t>
+      </w:r>
+      <w:r>
+        <w:t>stochastic partial differential equation</w:t>
+      </w:r>
+      <w:r>
+        <w:t>s</w:t>
+      </w:r>
+      <w:r>
+        <w:t xml:space="preserve"> </w:t>
+      </w:r>
+      <w:r>
+        <w:t xml:space="preserve">(SPDE) </w:t>
+      </w:r>
+      <w:r>
+        <w:t xml:space="preserve">to characterize the </w:t>
+      </w:r>
+      <w:r>
+        <w:t xml:space="preserve">Gaussian Markov </w:t>
+      </w:r>
+      <w:r>
+        <w:t xml:space="preserve">random </w:t>
+      </w:r>
+      <w:r>
+        <w:t xml:space="preserve">fields </w:t>
+      </w:r>
+      <w:r>
+        <w:rPr>
+          <w:rFonts w:eastAsiaTheme="minorEastAsia"/>
+        </w:rPr>
+        <w:t>(</w:t>
+      </w:r>
       <w:commentRangeStart w:id="1"/>
       <w:r>
-        <w:t>Barnett, Ward, and Anderson 2022</w:t>
+        <w:rPr>
+          <w:rFonts w:eastAsiaTheme="minorEastAsia"/>
+        </w:rPr>
+        <w:t>Lindgren, Rue, and Lindstrom 2011</w:t>
       </w:r>
       <w:commentRangeEnd w:id="1"/>
       <w:r>
@@ -389,77 +458,6 @@
           <w:rStyle w:val="CommentReference"/>
         </w:rPr>
         <w:commentReference w:id="1"/>
-      </w:r>
-      <w:r>
-        <w:t>)</w:t>
-      </w:r>
-      <w:r>
-        <w:t xml:space="preserve"> – </w:t>
-      </w:r>
-      <w:r>
-        <w:t xml:space="preserve">a </w:t>
-      </w:r>
-      <w:r>
-        <w:t xml:space="preserve">high level wrapper </w:t>
-      </w:r>
-      <w:r>
-        <w:t xml:space="preserve">for </w:t>
-      </w:r>
-      <w:r>
-        <w:t xml:space="preserve">modeling </w:t>
-      </w:r>
-      <w:r>
-        <w:t xml:space="preserve">continuous spatiotemporal heterogeneity across </w:t>
-      </w:r>
-      <w:r>
-        <w:t>the study domain</w:t>
-      </w:r>
-      <w:r>
-        <w:t xml:space="preserve"> using </w:t>
-      </w:r>
-      <w:r>
-        <w:t>stochastic partial differential equation</w:t>
-      </w:r>
-      <w:r>
-        <w:t>s</w:t>
-      </w:r>
-      <w:r>
-        <w:t xml:space="preserve"> </w:t>
-      </w:r>
-      <w:r>
-        <w:t xml:space="preserve">(SPDE) </w:t>
-      </w:r>
-      <w:r>
-        <w:t xml:space="preserve">to characterize the </w:t>
-      </w:r>
-      <w:r>
-        <w:t xml:space="preserve">Gaussian Markov </w:t>
-      </w:r>
-      <w:r>
-        <w:t xml:space="preserve">random </w:t>
-      </w:r>
-      <w:r>
-        <w:t xml:space="preserve">fields </w:t>
-      </w:r>
-      <w:r>
-        <w:rPr>
-          <w:rFonts w:eastAsiaTheme="minorEastAsia"/>
-        </w:rPr>
-        <w:t>(</w:t>
-      </w:r>
-      <w:commentRangeStart w:id="2"/>
-      <w:r>
-        <w:rPr>
-          <w:rFonts w:eastAsiaTheme="minorEastAsia"/>
-        </w:rPr>
-        <w:t>Lindgren, Rue, and Lindstrom 2011</w:t>
-      </w:r>
-      <w:commentRangeEnd w:id="2"/>
-      <w:r>
-        <w:rPr>
-          <w:rStyle w:val="CommentReference"/>
-        </w:rPr>
-        <w:commentReference w:id="2"/>
       </w:r>
       <w:r>
         <w:rPr>
@@ -1002,16 +1000,16 @@
       <w:r>
         <w:t xml:space="preserve"> the simulation-based R package DHARMa (</w:t>
       </w:r>
-      <w:commentRangeStart w:id="3"/>
+      <w:commentRangeStart w:id="2"/>
       <w:r>
         <w:t>Hartig 2022</w:t>
       </w:r>
-      <w:commentRangeEnd w:id="3"/>
+      <w:commentRangeEnd w:id="2"/>
       <w:r>
         <w:rPr>
           <w:rStyle w:val="CommentReference"/>
         </w:rPr>
-        <w:commentReference w:id="3"/>
+        <w:commentReference w:id="2"/>
       </w:r>
       <w:r>
         <w:t>) to examine issues of model misspecification based on the residuals</w:t>
@@ -1084,16 +1082,16 @@
       <w:r>
         <w:t xml:space="preserve">to 4 to allow for complexity while avoiding overfitting (Santana et al. </w:t>
       </w:r>
-      <w:commentRangeStart w:id="4"/>
+      <w:commentRangeStart w:id="3"/>
       <w:r>
         <w:t>2012</w:t>
       </w:r>
-      <w:commentRangeEnd w:id="4"/>
+      <w:commentRangeEnd w:id="3"/>
       <w:r>
         <w:rPr>
           <w:rStyle w:val="CommentReference"/>
         </w:rPr>
-        <w:commentReference w:id="4"/>
+        <w:commentReference w:id="3"/>
       </w:r>
       <w:r>
         <w:t>)</w:t>
@@ -1132,16 +1130,16 @@
       <w:r>
         <w:t xml:space="preserve"> were constructed using the mgcv package R (</w:t>
       </w:r>
-      <w:commentRangeStart w:id="5"/>
+      <w:commentRangeStart w:id="4"/>
       <w:r>
         <w:t>Wood 2004</w:t>
       </w:r>
-      <w:commentRangeEnd w:id="5"/>
+      <w:commentRangeEnd w:id="4"/>
       <w:r>
         <w:rPr>
           <w:rStyle w:val="CommentReference"/>
         </w:rPr>
-        <w:commentReference w:id="5"/>
+        <w:commentReference w:id="4"/>
       </w:r>
       <w:r>
         <w:t>)</w:t>
@@ -1749,16 +1747,16 @@
       <w:r>
         <w:t xml:space="preserve"> for a suite of R packages (</w:t>
       </w:r>
-      <w:commentRangeStart w:id="6"/>
+      <w:commentRangeStart w:id="5"/>
       <w:r>
         <w:t>Degenhardt, Seifert, and Szymczak 2019</w:t>
       </w:r>
-      <w:commentRangeEnd w:id="6"/>
+      <w:commentRangeEnd w:id="5"/>
       <w:r>
         <w:rPr>
           <w:rStyle w:val="CommentReference"/>
         </w:rPr>
-        <w:commentReference w:id="6"/>
+        <w:commentReference w:id="5"/>
       </w:r>
       <w:r>
         <w:t xml:space="preserve">); however, to maintain consistency </w:t>
@@ -2400,6 +2398,57 @@
         <w:t xml:space="preserve">. </w:t>
       </w:r>
     </w:p>
+    <w:p>
+      <w:bookmarkStart w:id="6" w:name="_GoBack"/>
+      <w:bookmarkEnd w:id="6"/>
+      <w:r>
+        <w:rPr>
+          <w:noProof/>
+        </w:rPr>
+        <w:lastRenderedPageBreak/>
+        <w:drawing>
+          <wp:inline distT="0" distB="0" distL="0" distR="0" wp14:anchorId="72C0D8D8" wp14:editId="54219CB7">
+            <wp:extent cx="5715000" cy="3810000"/>
+            <wp:effectExtent l="0" t="0" r="0" b="0"/>
+            <wp:docPr id="7" name="Picture 7"/>
+            <wp:cNvGraphicFramePr>
+              <a:graphicFrameLocks xmlns:a="http://schemas.openxmlformats.org/drawingml/2006/main" noChangeAspect="1"/>
+            </wp:cNvGraphicFramePr>
+            <a:graphic xmlns:a="http://schemas.openxmlformats.org/drawingml/2006/main">
+              <a:graphicData uri="http://schemas.openxmlformats.org/drawingml/2006/picture">
+                <pic:pic xmlns:pic="http://schemas.openxmlformats.org/drawingml/2006/picture">
+                  <pic:nvPicPr>
+                    <pic:cNvPr id="7" name="ggplot_predictive_rmse_2015_2019.png"/>
+                    <pic:cNvPicPr/>
+                  </pic:nvPicPr>
+                  <pic:blipFill>
+                    <a:blip r:embed="rId13">
+                      <a:extLst>
+                        <a:ext uri="{28A0092B-C50C-407E-A947-70E740481C1C}">
+                          <a14:useLocalDpi xmlns:a14="http://schemas.microsoft.com/office/drawing/2010/main" val="0"/>
+                        </a:ext>
+                      </a:extLst>
+                    </a:blip>
+                    <a:stretch>
+                      <a:fillRect/>
+                    </a:stretch>
+                  </pic:blipFill>
+                  <pic:spPr>
+                    <a:xfrm>
+                      <a:off x="0" y="0"/>
+                      <a:ext cx="5715000" cy="3810000"/>
+                    </a:xfrm>
+                    <a:prstGeom prst="rect">
+                      <a:avLst/>
+                    </a:prstGeom>
+                  </pic:spPr>
+                </pic:pic>
+              </a:graphicData>
+            </a:graphic>
+          </wp:inline>
+        </w:drawing>
+      </w:r>
+    </w:p>
     <w:p/>
     <w:p>
       <w:pPr>
@@ -2449,11 +2498,7 @@
         <w:t xml:space="preserve">in the data and returns a data frame </w:t>
       </w:r>
       <w:r>
-        <w:t xml:space="preserve">of juvenile and </w:t>
-      </w:r>
-      <w:r>
-        <w:lastRenderedPageBreak/>
-        <w:t xml:space="preserve">spawner </w:t>
+        <w:t xml:space="preserve">of juvenile and spawner </w:t>
       </w:r>
       <w:r>
         <w:t xml:space="preserve">density for the Coastal Oregon Evolutionary Significant Unit. The second function, </w:t>
@@ -2492,7 +2537,7 @@
 
 <file path=word/comments.xml><?xml version="1.0" encoding="utf-8"?>
 <w:comments xmlns:wpc="http://schemas.microsoft.com/office/word/2010/wordprocessingCanvas" xmlns:cx="http://schemas.microsoft.com/office/drawing/2014/chartex" xmlns:cx1="http://schemas.microsoft.com/office/drawing/2015/9/8/chartex" xmlns:mc="http://schemas.openxmlformats.org/markup-compatibility/2006" xmlns:o="urn:schemas-microsoft-com:office:office" xmlns:r="http://schemas.openxmlformats.org/officeDocument/2006/relationships" xmlns:m="http://schemas.openxmlformats.org/officeDocument/2006/math" xmlns:v="urn:schemas-microsoft-com:vml" xmlns:wp14="http://schemas.microsoft.com/office/word/2010/wordprocessingDrawing" xmlns:wp="http://schemas.openxmlformats.org/drawingml/2006/wordprocessingDrawing" xmlns:w10="urn:schemas-microsoft-com:office:word" xmlns:w="http://schemas.openxmlformats.org/wordprocessingml/2006/main" xmlns:w14="http://schemas.microsoft.com/office/word/2010/wordml" xmlns:w15="http://schemas.microsoft.com/office/word/2012/wordml" xmlns:w16se="http://schemas.microsoft.com/office/word/2015/wordml/symex" xmlns:wpg="http://schemas.microsoft.com/office/word/2010/wordprocessingGroup" xmlns:wpi="http://schemas.microsoft.com/office/word/2010/wordprocessingInk" xmlns:wne="http://schemas.microsoft.com/office/word/2006/wordml" xmlns:wps="http://schemas.microsoft.com/office/word/2010/wordprocessingShape" mc:Ignorable="w14 w15 w16se wp14">
-  <w:comment w:id="1" w:author="Chasco, Brandon Edward" w:date="2022-07-11T13:22:00Z" w:initials="CBE">
+  <w:comment w:id="0" w:author="Chasco, Brandon Edward" w:date="2022-07-11T13:22:00Z" w:initials="CBE">
     <w:p>
       <w:pPr>
         <w:pStyle w:val="CommentText"/>
@@ -2508,7 +2553,7 @@
       </w:r>
     </w:p>
   </w:comment>
-  <w:comment w:id="2" w:author="Chasco, Brandon Edward" w:date="2022-07-11T12:56:00Z" w:initials="CBE">
+  <w:comment w:id="1" w:author="Chasco, Brandon Edward" w:date="2022-07-11T12:56:00Z" w:initials="CBE">
     <w:p>
       <w:pPr>
         <w:pStyle w:val="CommentText"/>
@@ -2524,7 +2569,7 @@
       </w:r>
     </w:p>
   </w:comment>
-  <w:comment w:id="3" w:author="Chasco, Brandon Edward" w:date="2022-07-11T13:31:00Z" w:initials="CBE">
+  <w:comment w:id="2" w:author="Chasco, Brandon Edward" w:date="2022-07-11T13:31:00Z" w:initials="CBE">
     <w:p>
       <w:pPr>
         <w:pStyle w:val="CommentText"/>
@@ -2540,7 +2585,7 @@
       </w:r>
     </w:p>
   </w:comment>
-  <w:comment w:id="4" w:author="Chasco, Brandon Edward" w:date="2022-07-11T11:27:00Z" w:initials="CBE">
+  <w:comment w:id="3" w:author="Chasco, Brandon Edward" w:date="2022-07-11T11:27:00Z" w:initials="CBE">
     <w:p>
       <w:pPr>
         <w:pStyle w:val="CommentText"/>
@@ -2556,7 +2601,7 @@
       </w:r>
     </w:p>
   </w:comment>
-  <w:comment w:id="5" w:author="Chasco, Brandon Edward" w:date="2022-07-12T00:04:00Z" w:initials="CBE">
+  <w:comment w:id="4" w:author="Chasco, Brandon Edward" w:date="2022-07-12T00:04:00Z" w:initials="CBE">
     <w:p>
       <w:pPr>
         <w:pStyle w:val="CommentText"/>
@@ -2588,7 +2633,7 @@
       </w:r>
     </w:p>
   </w:comment>
-  <w:comment w:id="6" w:author="Chasco, Brandon Edward" w:date="2022-07-11T20:16:00Z" w:initials="CBE">
+  <w:comment w:id="5" w:author="Chasco, Brandon Edward" w:date="2022-07-11T20:16:00Z" w:initials="CBE">
     <w:p>
       <w:pPr>
         <w:pStyle w:val="CommentText"/>
@@ -3659,7 +3704,7 @@
 </file>
 
 <file path=customXml/itemProps1.xml><?xml version="1.0" encoding="utf-8"?>
-<ds:datastoreItem xmlns:ds="http://schemas.openxmlformats.org/officeDocument/2006/customXml" ds:itemID="{BF910EB0-0A88-4B4C-B1C5-249EBF43FC22}">
+<ds:datastoreItem xmlns:ds="http://schemas.openxmlformats.org/officeDocument/2006/customXml" ds:itemID="{608B5173-A7A8-4526-BC6A-5EC16DB86C62}">
   <ds:schemaRefs>
     <ds:schemaRef ds:uri="http://schemas.openxmlformats.org/officeDocument/2006/bibliography"/>
   </ds:schemaRefs>

</xml_diff>